<commit_message>
revert: undo last 3 commits (greeting fix, new file, LLM restriction)
</commit_message>
<xml_diff>
--- a/data/documents/WLAN_Process.docx
+++ b/data/documents/WLAN_Process.docx
@@ -52,7 +52,7 @@
         <w:t xml:space="preserve"> </w:t>
       </w:r>
       <w:r>
-        <w:t>Refer Image1</w:t>
+        <w:t>Image 1</w:t>
       </w:r>
     </w:p>
     <w:p>
@@ -135,10 +135,7 @@
         <w:t>.</w:t>
       </w:r>
       <w:r>
-        <w:t xml:space="preserve"> </w:t>
-      </w:r>
-      <w:r>
-        <w:t>Refer below Image2</w:t>
+        <w:t xml:space="preserve"> Image 2</w:t>
       </w:r>
     </w:p>
     <w:p>

</xml_diff>